<commit_message>
Updated the header in the word documents
</commit_message>
<xml_diff>
--- a/Electrical/Level 2 - 2365/1 - lessonOne/WriteUp/1 – First class notes (2365).docx
+++ b/Electrical/Level 2 - 2365/1 - lessonOne/WriteUp/1 – First class notes (2365).docx
@@ -565,7 +565,7 @@
       <w:rPr>
         <w:rtl w:val="0"/>
       </w:rPr>
-      <w:t xml:space="preserve">Isambard W-A - Class date: Sunday May 11 2025 </w:t>
+      <w:t xml:space="preserve">Sunday May 11th 2025 </w:t>
     </w:r>
   </w:p>
 </w:hdr>
@@ -592,11 +592,19 @@
       </w:pPr>
     </w:pPrDefault>
   </w:docDefaults>
+  <w:style w:type="table" w:styleId="TableNormal" w:default="1">
+    <w:name w:val="TableNormal"/>
+    <w:tblPr>
+      <w:tblCellMar>
+        <w:top w:w="100.0" w:type="dxa"/>
+        <w:left w:w="100.0" w:type="dxa"/>
+        <w:bottom w:w="100.0" w:type="dxa"/>
+        <w:right w:w="100.0" w:type="dxa"/>
+      </w:tblCellMar>
+    </w:tblPr>
+  </w:style>
   <w:style w:type="paragraph" w:styleId="Normal" w:default="1">
     <w:name w:val="normal"/>
-  </w:style>
-  <w:style w:type="table" w:styleId="TableNormal" w:default="1">
-    <w:name w:val="TableNormal"/>
   </w:style>
   <w:style w:type="paragraph" w:styleId="Heading1">
     <w:name w:val="heading 1"/>

</xml_diff>